<commit_message>
Fix Word export: merge CN-VN to same line, improve divider style
</commit_message>
<xml_diff>
--- a/vietnamese_dialogues.docx
+++ b/vietnamese_dialogues.docx
@@ -33,7 +33,7 @@
           <w:rFonts w:ascii="Arial" w:hAnsi="Arial" w:eastAsia="微软雅黑"/>
           <w:sz w:val="20"/>
         </w:rPr>
-        <w:t>──────────────────────────────────────────────────</w:t>
+        <w:t>────────────────────────────────────────────────────────────</w:t>
       </w:r>
     </w:p>
     <w:p>
@@ -135,7 +135,7 @@
           <w:rFonts w:ascii="Arial" w:hAnsi="Arial" w:eastAsia="微软雅黑"/>
           <w:sz w:val="20"/>
         </w:rPr>
-        <w:t>──────────────────────────────</w:t>
+        <w:t>────────────────────────────────────────────────────────────</w:t>
       </w:r>
     </w:p>
     <w:p>
@@ -237,7 +237,7 @@
           <w:rFonts w:ascii="Arial" w:hAnsi="Arial" w:eastAsia="微软雅黑"/>
           <w:sz w:val="20"/>
         </w:rPr>
-        <w:t>──────────────────────────────</w:t>
+        <w:t>────────────────────────────────────────────────────────────</w:t>
       </w:r>
     </w:p>
     <w:sectPr>

</xml_diff>